<commit_message>
Refresh proposal templates to the current offer
Nine tiers (solo leads with Nano/Micro), Agency R9,999 / partner R6,999, no
trials, no pilot, no money-back; lead guarantee with its conditions; only
live capabilities, in-setup ones labelled; Founding Member without dates;
no VAT line. QA forbidden list updated to match CURRENT_OFFER.md. Embedded
infographics are rebuilt again once the asset refresh lands.

Co-Authored-By: Claude Opus 5.5 <noreply@anthropic.com>
Claude-Session: https://claude.ai/code/session_011sciWmQNcts4uDwB8L9SPT
</commit_message>
<xml_diff>
--- a/docs/go-to-market/03_Proposal_Templates/FluxMuse_Proposal_Agency_Partner.docx
+++ b/docs/go-to-market/03_Proposal_Templates/FluxMuse_Proposal_Agency_Partner.docx
@@ -325,33 +325,9 @@
             </w:pPr>
             <w:r>
               <w:rPr>
-                <w:b/>
-                <w:color w:val="20242B"/>
-                <w:sz w:val="20"/>
-                <w:shd w:val="clear" w:color="auto" w:fill="FFF1A8"/>
-              </w:rPr>
-              <w:t>[[NAME]]</w:t>
-            </w:r>
-            <w:r>
-              <w:rPr>
                 <w:sz w:val="20"/>
               </w:rPr>
-              <w:t xml:space="preserve">, </w:t>
-            </w:r>
-            <w:r>
-              <w:rPr>
-                <w:b/>
-                <w:color w:val="20242B"/>
-                <w:sz w:val="20"/>
-                <w:shd w:val="clear" w:color="auto" w:fill="FFF1A8"/>
-              </w:rPr>
-              <w:t>[[TITLE]]</w:t>
-            </w:r>
-            <w:r>
-              <w:rPr>
-                <w:sz w:val="20"/>
-              </w:rPr>
-              <w:t>, Fluxmuse Pty Ltd</w:t>
+              <w:t>Thabo Malebadi, Founder, Fluxmuse (Pty) Ltd</w:t>
             </w:r>
           </w:p>
           <w:p>
@@ -360,18 +336,9 @@
             </w:pPr>
             <w:r>
               <w:rPr>
-                <w:b/>
-                <w:color w:val="20242B"/>
-                <w:sz w:val="20"/>
-                <w:shd w:val="clear" w:color="auto" w:fill="FFF1A8"/>
-              </w:rPr>
-              <w:t>[[EMAIL]]</w:t>
-            </w:r>
-            <w:r>
-              <w:rPr>
                 <w:sz w:val="20"/>
               </w:rPr>
-              <w:t xml:space="preserve"> · </w:t>
+              <w:t xml:space="preserve">thabo@fluxmuse.com · </w:t>
             </w:r>
             <w:r>
               <w:rPr>
@@ -460,23 +427,7 @@
           <w:color w:val="5B6570"/>
           <w:sz w:val="17"/>
         </w:rPr>
-        <w:t xml:space="preserve"> only. Prices in South African rand (ZAR) and exclusive of VAT unless stated </w:t>
-      </w:r>
-      <w:r>
-        <w:rPr>
-          <w:b/>
-          <w:color w:val="20242B"/>
-          <w:sz w:val="17"/>
-          <w:shd w:val="clear" w:color="auto" w:fill="FFF1A8"/>
-        </w:rPr>
-        <w:t>[[CONFIRM VAT TREATMENT]]</w:t>
-      </w:r>
-      <w:r>
-        <w:rPr>
-          <w:color w:val="5B6570"/>
-          <w:sz w:val="17"/>
-        </w:rPr>
-        <w:t>.</w:t>
+        <w:t xml:space="preserve"> only. Prices in South African rand (ZAR); the price shown is the amount charged.</w:t>
       </w:r>
     </w:p>
     <w:p>
@@ -647,7 +598,7 @@
                 <w:sz w:val="19"/>
               </w:rPr>
               <w:tab/>
-              <w:t>Quote prices only from the facts file (00_FACTS_AND_ASSUMPTIONS.md). Founding Member prices (Starter R349, Growth R1,399, Scale R3,499 for the first 2 monthly bills) apply to South African sign-ups from 1 December 2026 to 31 January 2027; in Nigeria, Kenya and Ghana the same 30% applies in the first 60 days after each country's launch. Never on the Agency tier. Say “Founding Member badge and priority support” with no duration.</w:t>
+              <w:t>Quote prices only from 08_Prospects/CURRENT_OFFER.md. Every paid plan starts with payment: no trials, no free period. Free is a permanent plan, never a trial and never the lead offer.</w:t>
             </w:r>
           </w:p>
           <w:p>
@@ -684,7 +635,7 @@
                 <w:sz w:val="19"/>
               </w:rPr>
               <w:tab/>
-              <w:t>KPI numbers are always “Target (goal)”, never results. No customer counts, ratings, testimonials or pilot results until consented pilot data exists (from December 2026).</w:t>
+              <w:t>Founding Member is live for South African sign-ups: 30% off the first two monthly bills on Starter, Growth and Scale. No end date is set, so don't print one. Never on Agency or partner wholesale.</w:t>
             </w:r>
           </w:p>
           <w:p>
@@ -721,7 +672,7 @@
                 <w:sz w:val="19"/>
               </w:rPr>
               <w:tab/>
-              <w:t>Instagram publishing, comments and DMs are pending Meta approval (in App Review). Never promise them as live.</w:t>
+              <w:t>Guarantee: only the lead guarantee, always with its conditions. Never promise cash back, sales or results.</w:t>
             </w:r>
           </w:p>
           <w:p>
@@ -758,7 +709,81 @@
                 <w:sz w:val="19"/>
               </w:rPr>
               <w:tab/>
-              <w:t>Quote prices only to businesses in the 23 rail-covered countries. Everyone else, including Botswana and Namibia (coming soon), joins the waitlist: no prices, no checkout.</w:t>
+              <w:t>FluxMuse has no customers or results yet. No customer counts, ratings, testimonials or case-study numbers. KPI numbers are always “Target (goal)”. Describe live features as “newly launched”.</w:t>
+            </w:r>
+          </w:p>
+          <w:p>
+            <w:pPr>
+              <w:tabs>
+                <w:tab w:pos="397" w:val="left"/>
+              </w:tabs>
+              <w:spacing w:after="60"/>
+              <w:ind w:left="397" w:hanging="397"/>
+            </w:pPr>
+            <w:sdt>
+              <w:sdtPr>
+                <w:rPr>
+                  <w:rFonts w:ascii="MS Gothic" w:eastAsia="MS Gothic" w:hAnsi="MS Gothic" w:hint="eastAsia"/>
+                </w:rPr>
+                <w14:checkbox>
+                  <w14:checked w14:val="0"/>
+                  <w14:checkedState w14:val="2612" w14:font="MS Gothic"/>
+                  <w14:uncheckedState w14:val="2610" w14:font="MS Gothic"/>
+                </w14:checkbox>
+              </w:sdtPr>
+              <w:sdtContent>
+                <w:r>
+                  <w:rPr>
+                    <w:rFonts w:ascii="MS Gothic" w:eastAsia="MS Gothic" w:hAnsi="MS Gothic" w:hint="eastAsia"/>
+                    <w:color w:val="20242B"/>
+                  </w:rPr>
+                  <w:t>☐</w:t>
+                </w:r>
+              </w:sdtContent>
+            </w:sdt>
+            <w:r>
+              <w:rPr>
+                <w:sz w:val="19"/>
+              </w:rPr>
+              <w:tab/>
+              <w:t>Being switched on, never live: Facebook and Instagram auto-posting, checkout through FluxMuse, AI Voice (beta), daily digest, store sync. Not available: Instagram DMs and comments, checkout outside South Africa.</w:t>
+            </w:r>
+          </w:p>
+          <w:p>
+            <w:pPr>
+              <w:tabs>
+                <w:tab w:pos="397" w:val="left"/>
+              </w:tabs>
+              <w:spacing w:after="60"/>
+              <w:ind w:left="397" w:hanging="397"/>
+            </w:pPr>
+            <w:sdt>
+              <w:sdtPr>
+                <w:rPr>
+                  <w:rFonts w:ascii="MS Gothic" w:eastAsia="MS Gothic" w:hAnsi="MS Gothic" w:hint="eastAsia"/>
+                </w:rPr>
+                <w14:checkbox>
+                  <w14:checked w14:val="0"/>
+                  <w14:checkedState w14:val="2612" w14:font="MS Gothic"/>
+                  <w14:uncheckedState w14:val="2610" w14:font="MS Gothic"/>
+                </w14:checkbox>
+              </w:sdtPr>
+              <w:sdtContent>
+                <w:r>
+                  <w:rPr>
+                    <w:rFonts w:ascii="MS Gothic" w:eastAsia="MS Gothic" w:hAnsi="MS Gothic" w:hint="eastAsia"/>
+                    <w:color w:val="20242B"/>
+                  </w:rPr>
+                  <w:t>☐</w:t>
+                </w:r>
+              </w:sdtContent>
+            </w:sdt>
+            <w:r>
+              <w:rPr>
+                <w:sz w:val="19"/>
+              </w:rPr>
+              <w:tab/>
+              <w:t>South Africa only for paid plans. Prospects elsewhere join the waitlist: no prices, no checkout.</w:t>
             </w:r>
           </w:p>
           <w:p>
@@ -847,7 +872,7 @@
                 <w:sz w:val="19"/>
               </w:rPr>
               <w:tab/>
-              <w:t>Agencies get the permanent partner wholesale price (R5,599/mo). Never present R5,599 as a 2-month launch discount, and never add Founding Member on top.</w:t>
+              <w:t>Agencies get the partner wholesale price of R6,999/mo (30% off the R9,999 Agency list price). Never present it as a launch discount, and never add Founding Member on top.</w:t>
             </w:r>
           </w:p>
           <w:p>
@@ -1380,7 +1405,7 @@
               <w:rPr>
                 <w:sz w:val="19"/>
               </w:rPr>
-              <w:t>Full white-label, 50 client sub-accounts and reseller billing on one platform, with custom and white-label reports</w:t>
+              <w:t>White-label and multi-client on one platform, with unlimited brands and 80 channels</w:t>
             </w:r>
           </w:p>
         </w:tc>
@@ -1420,7 +1445,7 @@
               <w:rPr>
                 <w:sz w:val="19"/>
               </w:rPr>
-              <w:t>Resell the AI marketing team and checkout inside WhatsApp under your own brand</w:t>
+              <w:t>Resell WhatsApp shops, AI posts and order alerts under your own brand</w:t>
             </w:r>
           </w:p>
         </w:tc>
@@ -1441,7 +1466,7 @@
         <w:drawing>
           <wp:inline xmlns:a="http://schemas.openxmlformats.org/drawingml/2006/main" xmlns:pic="http://schemas.openxmlformats.org/drawingml/2006/picture">
             <wp:extent cx="6120000" cy="3442500"/>
-            <wp:docPr id="2" name="Picture 2" descr="Segment card for agencies: margin squeeze, manual reporting and client demand for WhatsApp commerce, matched to wholesale pricing, white-label sub-accounts and reseller billing."/>
+            <wp:docPr id="2" name="Picture 2" descr="Segment card for agencies: margin squeeze, manual reporting and client demand for WhatsApp commerce, matched to wholesale pricing and white-label, multi-client tools."/>
             <wp:cNvGraphicFramePr>
               <a:graphicFrameLocks noChangeAspect="1"/>
             </wp:cNvGraphicFramePr>
@@ -1546,7 +1571,7 @@
               <w:rPr>
                 <w:sz w:val="19"/>
               </w:rPr>
-              <w:t>Live today on the Agency tier: full white-label, client sub-accounts, reseller billing and the partner directory.</w:t>
+              <w:t>FluxMuse is newly launched and has no agency partners yet. You would be among the first, and we set you up by hand.</w:t>
             </w:r>
           </w:p>
           <w:p>
@@ -1557,7 +1582,27 @@
               <w:rPr>
                 <w:sz w:val="19"/>
               </w:rPr>
-              <w:t>On the roadmap (indicative, not dated): the wider Flux_Partner programme, including referral tracking and partner-managed workspaces. We'll confirm dates before they're offered.</w:t>
+              <w:t xml:space="preserve">On the Agency tier: white-label, multi-client, unlimited brands, 80 channels, bring your own cloud. </w:t>
+            </w:r>
+            <w:r>
+              <w:rPr>
+                <w:b/>
+                <w:color w:val="20242B"/>
+                <w:sz w:val="19"/>
+                <w:shd w:val="clear" w:color="auto" w:fill="FFF1A8"/>
+              </w:rPr>
+              <w:t>[[FOUNDER TO CONFIRM: reseller billing and partner directory status]]</w:t>
+            </w:r>
+          </w:p>
+          <w:p>
+            <w:pPr>
+              <w:spacing w:after="80"/>
+            </w:pPr>
+            <w:r>
+              <w:rPr>
+                <w:sz w:val="19"/>
+              </w:rPr>
+              <w:t>On the roadmap (indicative, not dated): referral tracking and the wider Flux_Partner programme.</w:t>
             </w:r>
           </w:p>
         </w:tc>
@@ -1671,7 +1716,7 @@
                 <w:b/>
                 <w:sz w:val="19"/>
               </w:rPr>
-              <w:t>Full white-label</w:t>
+              <w:t>White-label</w:t>
             </w:r>
           </w:p>
         </w:tc>
@@ -1721,7 +1766,7 @@
                 <w:b/>
                 <w:sz w:val="19"/>
               </w:rPr>
-              <w:t>50 client sub-accounts</w:t>
+              <w:t>Multi-client</w:t>
             </w:r>
           </w:p>
         </w:tc>
@@ -1739,7 +1784,16 @@
               <w:rPr>
                 <w:sz w:val="19"/>
               </w:rPr>
-              <w:t>One workspace per client, managed by your team</w:t>
+              <w:t xml:space="preserve">One workspace per client, managed by your team </w:t>
+            </w:r>
+            <w:r>
+              <w:rPr>
+                <w:b/>
+                <w:color w:val="20242B"/>
+                <w:sz w:val="19"/>
+                <w:shd w:val="clear" w:color="auto" w:fill="FFF1A8"/>
+              </w:rPr>
+              <w:t>[[CONFIRM: sub-account limit]]</w:t>
             </w:r>
           </w:p>
         </w:tc>
@@ -1762,7 +1816,7 @@
                 <w:b/>
                 <w:sz w:val="19"/>
               </w:rPr>
-              <w:t>Reseller billing</w:t>
+              <w:t>Unlimited brands, 80 channels</w:t>
             </w:r>
           </w:p>
         </w:tc>
@@ -1779,7 +1833,7 @@
               <w:rPr>
                 <w:sz w:val="19"/>
               </w:rPr>
-              <w:t>Bill clients at the retail price you set</w:t>
+              <w:t>Across all your clients</w:t>
             </w:r>
           </w:p>
         </w:tc>
@@ -1803,7 +1857,7 @@
                 <w:b/>
                 <w:sz w:val="19"/>
               </w:rPr>
-              <w:t>80 channels</w:t>
+              <w:t>Bring your own cloud</w:t>
             </w:r>
           </w:p>
         </w:tc>
@@ -1821,7 +1875,16 @@
               <w:rPr>
                 <w:sz w:val="19"/>
               </w:rPr>
-              <w:t>WhatsApp, Facebook Pages, Messenger, email, SMS, USSD and more across your clients (Instagram once Meta approves it)</w:t>
+              <w:t xml:space="preserve">Run on your own cloud account if you want to </w:t>
+            </w:r>
+            <w:r>
+              <w:rPr>
+                <w:b/>
+                <w:color w:val="20242B"/>
+                <w:sz w:val="19"/>
+                <w:shd w:val="clear" w:color="auto" w:fill="FFF1A8"/>
+              </w:rPr>
+              <w:t>[[CONFIRM SCOPE]]</w:t>
             </w:r>
           </w:p>
         </w:tc>
@@ -1844,7 +1907,7 @@
                 <w:b/>
                 <w:sz w:val="19"/>
               </w:rPr>
-              <w:t>500,000 AI credits a month</w:t>
+              <w:t>AI credits</w:t>
             </w:r>
           </w:p>
         </w:tc>
@@ -1861,7 +1924,7 @@
               <w:rPr>
                 <w:sz w:val="19"/>
               </w:rPr>
-              <w:t xml:space="preserve">For Strategist, Creator, Publisher, Analyst and specialist Flux agents </w:t>
+              <w:t xml:space="preserve">Included; see fluxmuse.ai/pricing </w:t>
             </w:r>
             <w:r>
               <w:rPr>
@@ -1870,7 +1933,7 @@
                 <w:sz w:val="19"/>
                 <w:shd w:val="clear" w:color="auto" w:fill="FFF1A8"/>
               </w:rPr>
-              <w:t>[[CONFIRM HOW CREDITS ARE SHARED ACROSS SUB-ACCOUNTS]]</w:t>
+              <w:t>[[CONFIRM HOW CREDITS ARE SHARED ACROSS CLIENTS]]</w:t>
             </w:r>
           </w:p>
         </w:tc>
@@ -1894,7 +1957,7 @@
                 <w:b/>
                 <w:sz w:val="19"/>
               </w:rPr>
-              <w:t>Unlimited brands</w:t>
+              <w:t>Live for your clients (newly launched)</w:t>
             </w:r>
           </w:p>
         </w:tc>
@@ -1912,7 +1975,7 @@
               <w:rPr>
                 <w:sz w:val="19"/>
               </w:rPr>
-              <w:t>No per-brand limit on the Agency plan</w:t>
+              <w:t>WhatsApp Concierge, hosted shop links, order alerts, AI captions, images and short video, WhatsApp broadcasts to opted-in contacts, TikTok video posting</w:t>
             </w:r>
           </w:p>
         </w:tc>
@@ -1935,7 +1998,7 @@
                 <w:b/>
                 <w:sz w:val="19"/>
               </w:rPr>
-              <w:t>Dedicated support</w:t>
+              <w:t>Being switched on</w:t>
             </w:r>
           </w:p>
         </w:tc>
@@ -1952,16 +2015,7 @@
               <w:rPr>
                 <w:sz w:val="19"/>
               </w:rPr>
-              <w:t xml:space="preserve">A named contact at FluxMuse: </w:t>
-            </w:r>
-            <w:r>
-              <w:rPr>
-                <w:b/>
-                <w:color w:val="20242B"/>
-                <w:sz w:val="19"/>
-                <w:shd w:val="clear" w:color="auto" w:fill="FFF1A8"/>
-              </w:rPr>
-              <w:t>[[NAME]]</w:t>
+              <w:t>Checkout through FluxMuse, Facebook and Instagram auto-posting, AI Voice (beta)</w:t>
             </w:r>
           </w:p>
         </w:tc>
@@ -1985,7 +2039,7 @@
                 <w:b/>
                 <w:sz w:val="19"/>
               </w:rPr>
-              <w:t>WhatsApp commerce for clients</w:t>
+              <w:t>Support</w:t>
             </w:r>
           </w:p>
         </w:tc>
@@ -2003,98 +2057,7 @@
               <w:rPr>
                 <w:sz w:val="19"/>
               </w:rPr>
-              <w:t>Catalog, checkout in chat, order updates and abandoned-cart recovery</w:t>
-            </w:r>
-          </w:p>
-        </w:tc>
-      </w:tr>
-      <w:tr>
-        <w:trPr>
-          <w:cantSplit/>
-        </w:trPr>
-        <w:tc>
-          <w:tcPr>
-            <w:tcW w:type="dxa" w:w="2608"/>
-            <w:vAlign w:val="center"/>
-          </w:tcPr>
-          <w:p>
-            <w:pPr>
-              <w:spacing w:after="20" w:line="252" w:lineRule="auto"/>
-            </w:pPr>
-            <w:r>
-              <w:rPr>
-                <w:b/>
-                <w:sz w:val="19"/>
-              </w:rPr>
-              <w:t>Local payments</w:t>
-            </w:r>
-          </w:p>
-        </w:tc>
-        <w:tc>
-          <w:tcPr>
-            <w:tcW w:type="dxa" w:w="7030"/>
-            <w:vAlign w:val="center"/>
-          </w:tcPr>
-          <w:p>
-            <w:pPr>
-              <w:spacing w:after="20" w:line="252" w:lineRule="auto"/>
-            </w:pPr>
-            <w:r>
-              <w:rPr>
-                <w:sz w:val="19"/>
-              </w:rPr>
-              <w:t>5 payment rails across 23 African countries</w:t>
-            </w:r>
-          </w:p>
-        </w:tc>
-      </w:tr>
-      <w:tr>
-        <w:trPr>
-          <w:cantSplit/>
-        </w:trPr>
-        <w:tc>
-          <w:tcPr>
-            <w:tcW w:type="dxa" w:w="2608"/>
-            <w:shd w:val="clear" w:color="auto" w:fill="FAFAFB"/>
-            <w:vAlign w:val="center"/>
-          </w:tcPr>
-          <w:p>
-            <w:pPr>
-              <w:spacing w:after="20" w:line="252" w:lineRule="auto"/>
-            </w:pPr>
-            <w:r>
-              <w:rPr>
-                <w:b/>
-                <w:sz w:val="19"/>
-              </w:rPr>
-              <w:t>Partner directory</w:t>
-            </w:r>
-          </w:p>
-        </w:tc>
-        <w:tc>
-          <w:tcPr>
-            <w:tcW w:type="dxa" w:w="7030"/>
-            <w:shd w:val="clear" w:color="auto" w:fill="FAFAFB"/>
-            <w:vAlign w:val="center"/>
-          </w:tcPr>
-          <w:p>
-            <w:pPr>
-              <w:spacing w:after="20" w:line="252" w:lineRule="auto"/>
-            </w:pPr>
-            <w:r>
-              <w:rPr>
-                <w:sz w:val="19"/>
-              </w:rPr>
-              <w:t xml:space="preserve">Listing so businesses can find you </w:t>
-            </w:r>
-            <w:r>
-              <w:rPr>
-                <w:b/>
-                <w:color w:val="20242B"/>
-                <w:sz w:val="19"/>
-                <w:shd w:val="clear" w:color="auto" w:fill="FFF1A8"/>
-              </w:rPr>
-              <w:t>[[CONFIRM LISTING CRITERIA]]</w:t>
+              <w:t>Direct line to Thabo Malebadi, thabo@fluxmuse.com</w:t>
             </w:r>
           </w:p>
         </w:tc>
@@ -2127,7 +2090,7 @@
       </w:r>
       <w:r>
         <w:rPr/>
-        <w:t>, permanently, then set their own retail price for clients. Same inclusions as the Agency plan.</w:t>
+        <w:t xml:space="preserve"> for as long as the partner agreement is active, then set their own retail price for clients. Same inclusions as the Agency plan.</w:t>
       </w:r>
     </w:p>
     <w:tbl>
@@ -2150,14 +2113,12 @@
           <w:right w:w="100" w:type="dxa"/>
         </w:tblCellMar>
         <w:tblLook w:firstColumn="1" w:firstRow="1" w:lastColumn="0" w:lastRow="0" w:noHBand="0" w:noVBand="1" w:val="04A0"/>
-        <w:tblCaption w:val="Partner wholesale pricing by currency"/>
+        <w:tblCaption w:val="Partner wholesale pricing"/>
       </w:tblPr>
       <w:tblGrid>
-        <w:gridCol w:w="1247"/>
-        <w:gridCol w:w="2607"/>
-        <w:gridCol w:w="1814"/>
-        <w:gridCol w:w="2040"/>
-        <w:gridCol w:w="1927"/>
+        <w:gridCol w:w="2834"/>
+        <w:gridCol w:w="3401"/>
+        <w:gridCol w:w="3401"/>
       </w:tblGrid>
       <w:tr>
         <w:trPr>
@@ -2166,7 +2127,7 @@
         </w:trPr>
         <w:tc>
           <w:tcPr>
-            <w:tcW w:type="dxa" w:w="1247"/>
+            <w:tcW w:type="dxa" w:w="2835"/>
             <w:shd w:val="clear" w:color="auto" w:fill="FF6A00"/>
             <w:vAlign w:val="center"/>
           </w:tcPr>
@@ -2175,42 +2136,11 @@
               <w:keepNext/>
               <w:spacing w:after="20" w:line="252" w:lineRule="auto"/>
             </w:pPr>
-            <w:r>
-              <w:rPr>
-                <w:rFonts w:ascii="Poppins" w:hAnsi="Poppins" w:cs="Poppins" w:eastAsia="Poppins"/>
-                <w:b/>
-                <w:color w:val="20242B"/>
-                <w:sz w:val="19"/>
-              </w:rPr>
-              <w:t>Currency</w:t>
-            </w:r>
           </w:p>
         </w:tc>
         <w:tc>
           <w:tcPr>
-            <w:tcW w:type="dxa" w:w="2608"/>
-            <w:shd w:val="clear" w:color="auto" w:fill="FF6A00"/>
-            <w:vAlign w:val="center"/>
-          </w:tcPr>
-          <w:p>
-            <w:pPr>
-              <w:keepNext/>
-              <w:spacing w:after="20" w:line="252" w:lineRule="auto"/>
-            </w:pPr>
-            <w:r>
-              <w:rPr>
-                <w:rFonts w:ascii="Poppins" w:hAnsi="Poppins" w:cs="Poppins" w:eastAsia="Poppins"/>
-                <w:b/>
-                <w:color w:val="20242B"/>
-                <w:sz w:val="19"/>
-              </w:rPr>
-              <w:t>Where</w:t>
-            </w:r>
-          </w:p>
-        </w:tc>
-        <w:tc>
-          <w:tcPr>
-            <w:tcW w:type="dxa" w:w="1814"/>
+            <w:tcW w:type="dxa" w:w="3402"/>
             <w:shd w:val="clear" w:color="auto" w:fill="FF6A00"/>
             <w:vAlign w:val="center"/>
           </w:tcPr>
@@ -2227,13 +2157,13 @@
                 <w:color w:val="20242B"/>
                 <w:sz w:val="19"/>
               </w:rPr>
-              <w:t>Agency list /mo</w:t>
+              <w:t>Agency list</w:t>
             </w:r>
           </w:p>
         </w:tc>
         <w:tc>
           <w:tcPr>
-            <w:tcW w:type="dxa" w:w="2041"/>
+            <w:tcW w:type="dxa" w:w="3402"/>
             <w:shd w:val="clear" w:color="auto" w:fill="FF6A00"/>
             <w:vAlign w:val="center"/>
           </w:tcPr>
@@ -2250,30 +2180,7 @@
                 <w:color w:val="20242B"/>
                 <w:sz w:val="19"/>
               </w:rPr>
-              <w:t>Partner wholesale /mo</w:t>
-            </w:r>
-          </w:p>
-        </w:tc>
-        <w:tc>
-          <w:tcPr>
-            <w:tcW w:type="dxa" w:w="1928"/>
-            <w:shd w:val="clear" w:color="auto" w:fill="FF6A00"/>
-            <w:vAlign w:val="center"/>
-          </w:tcPr>
-          <w:p>
-            <w:pPr>
-              <w:keepNext/>
-              <w:spacing w:after="20" w:line="252" w:lineRule="auto"/>
-              <w:jc w:val="right"/>
-            </w:pPr>
-            <w:r>
-              <w:rPr>
-                <w:rFonts w:ascii="Poppins" w:hAnsi="Poppins" w:cs="Poppins" w:eastAsia="Poppins"/>
-                <w:b/>
-                <w:color w:val="20242B"/>
-                <w:sz w:val="19"/>
-              </w:rPr>
-              <w:t>Partner wholesale /yr</w:t>
+              <w:t>Partner wholesale</w:t>
             </w:r>
           </w:p>
         </w:tc>
@@ -2284,7 +2191,7 @@
         </w:trPr>
         <w:tc>
           <w:tcPr>
-            <w:tcW w:type="dxa" w:w="1247"/>
+            <w:tcW w:type="dxa" w:w="2835"/>
             <w:shd w:val="clear" w:color="auto" w:fill="FFF4EB"/>
             <w:vAlign w:val="center"/>
           </w:tcPr>
@@ -2297,31 +2204,13 @@
                 <w:b/>
                 <w:sz w:val="19"/>
               </w:rPr>
-              <w:t>ZAR</w:t>
+              <w:t>Monthly</w:t>
             </w:r>
           </w:p>
         </w:tc>
         <w:tc>
           <w:tcPr>
-            <w:tcW w:type="dxa" w:w="2608"/>
-            <w:shd w:val="clear" w:color="auto" w:fill="FFF4EB"/>
-            <w:vAlign w:val="center"/>
-          </w:tcPr>
-          <w:p>
-            <w:pPr>
-              <w:spacing w:after="20" w:line="252" w:lineRule="auto"/>
-            </w:pPr>
-            <w:r>
-              <w:rPr>
-                <w:sz w:val="19"/>
-              </w:rPr>
-              <w:t>South Africa</w:t>
-            </w:r>
-          </w:p>
-        </w:tc>
-        <w:tc>
-          <w:tcPr>
-            <w:tcW w:type="dxa" w:w="1814"/>
+            <w:tcW w:type="dxa" w:w="3402"/>
             <w:shd w:val="clear" w:color="auto" w:fill="FFF4EB"/>
             <w:vAlign w:val="center"/>
           </w:tcPr>
@@ -2334,13 +2223,13 @@
               <w:rPr>
                 <w:sz w:val="19"/>
               </w:rPr>
-              <w:t>R7,999</w:t>
+              <w:t>R9,999</w:t>
             </w:r>
           </w:p>
         </w:tc>
         <w:tc>
           <w:tcPr>
-            <w:tcW w:type="dxa" w:w="2041"/>
+            <w:tcW w:type="dxa" w:w="3402"/>
             <w:shd w:val="clear" w:color="auto" w:fill="FFF4EB"/>
             <w:vAlign w:val="center"/>
           </w:tcPr>
@@ -2353,26 +2242,7 @@
               <w:rPr>
                 <w:sz w:val="19"/>
               </w:rPr>
-              <w:t>R5,599</w:t>
-            </w:r>
-          </w:p>
-        </w:tc>
-        <w:tc>
-          <w:tcPr>
-            <w:tcW w:type="dxa" w:w="1928"/>
-            <w:shd w:val="clear" w:color="auto" w:fill="FFF4EB"/>
-            <w:vAlign w:val="center"/>
-          </w:tcPr>
-          <w:p>
-            <w:pPr>
-              <w:spacing w:after="20" w:line="252" w:lineRule="auto"/>
-              <w:jc w:val="right"/>
-            </w:pPr>
-            <w:r>
-              <w:rPr>
-                <w:sz w:val="19"/>
-              </w:rPr>
-              <w:t>R55,990</w:t>
+              <w:t>R6,999</w:t>
             </w:r>
           </w:p>
         </w:tc>
@@ -2383,7 +2253,7 @@
         </w:trPr>
         <w:tc>
           <w:tcPr>
-            <w:tcW w:type="dxa" w:w="1247"/>
+            <w:tcW w:type="dxa" w:w="2835"/>
             <w:shd w:val="clear" w:color="auto" w:fill="FAFAFB"/>
             <w:vAlign w:val="center"/>
           </w:tcPr>
@@ -2396,31 +2266,13 @@
                 <w:b/>
                 <w:sz w:val="19"/>
               </w:rPr>
-              <w:t>NGN</w:t>
+              <w:t>Annual (10× monthly)</w:t>
             </w:r>
           </w:p>
         </w:tc>
         <w:tc>
           <w:tcPr>
-            <w:tcW w:type="dxa" w:w="2608"/>
-            <w:shd w:val="clear" w:color="auto" w:fill="FAFAFB"/>
-            <w:vAlign w:val="center"/>
-          </w:tcPr>
-          <w:p>
-            <w:pPr>
-              <w:spacing w:after="20" w:line="252" w:lineRule="auto"/>
-            </w:pPr>
-            <w:r>
-              <w:rPr>
-                <w:sz w:val="19"/>
-              </w:rPr>
-              <w:t>Nigeria</w:t>
-            </w:r>
-          </w:p>
-        </w:tc>
-        <w:tc>
-          <w:tcPr>
-            <w:tcW w:type="dxa" w:w="1814"/>
+            <w:tcW w:type="dxa" w:w="3402"/>
             <w:shd w:val="clear" w:color="auto" w:fill="FAFAFB"/>
             <w:vAlign w:val="center"/>
           </w:tcPr>
@@ -2433,13 +2285,13 @@
               <w:rPr>
                 <w:sz w:val="19"/>
               </w:rPr>
-              <w:t>₦662,000</w:t>
+              <w:t>R99,990</w:t>
             </w:r>
           </w:p>
         </w:tc>
         <w:tc>
           <w:tcPr>
-            <w:tcW w:type="dxa" w:w="2041"/>
+            <w:tcW w:type="dxa" w:w="3402"/>
             <w:shd w:val="clear" w:color="auto" w:fill="FAFAFB"/>
             <w:vAlign w:val="center"/>
           </w:tcPr>
@@ -2452,313 +2304,7 @@
               <w:rPr>
                 <w:sz w:val="19"/>
               </w:rPr>
-              <w:t>₦463,000</w:t>
-            </w:r>
-          </w:p>
-        </w:tc>
-        <w:tc>
-          <w:tcPr>
-            <w:tcW w:type="dxa" w:w="1928"/>
-            <w:shd w:val="clear" w:color="auto" w:fill="FAFAFB"/>
-            <w:vAlign w:val="center"/>
-          </w:tcPr>
-          <w:p>
-            <w:pPr>
-              <w:spacing w:after="20" w:line="252" w:lineRule="auto"/>
-              <w:jc w:val="right"/>
-            </w:pPr>
-            <w:r>
-              <w:rPr>
-                <w:sz w:val="19"/>
-              </w:rPr>
-              <w:t>₦4,630,000</w:t>
-            </w:r>
-          </w:p>
-        </w:tc>
-      </w:tr>
-      <w:tr>
-        <w:trPr>
-          <w:cantSplit/>
-        </w:trPr>
-        <w:tc>
-          <w:tcPr>
-            <w:tcW w:type="dxa" w:w="1247"/>
-            <w:vAlign w:val="center"/>
-          </w:tcPr>
-          <w:p>
-            <w:pPr>
-              <w:spacing w:after="20" w:line="252" w:lineRule="auto"/>
-            </w:pPr>
-            <w:r>
-              <w:rPr>
-                <w:b/>
-                <w:sz w:val="19"/>
-              </w:rPr>
-              <w:t>KES</w:t>
-            </w:r>
-          </w:p>
-        </w:tc>
-        <w:tc>
-          <w:tcPr>
-            <w:tcW w:type="dxa" w:w="2608"/>
-            <w:vAlign w:val="center"/>
-          </w:tcPr>
-          <w:p>
-            <w:pPr>
-              <w:spacing w:after="20" w:line="252" w:lineRule="auto"/>
-            </w:pPr>
-            <w:r>
-              <w:rPr>
-                <w:sz w:val="19"/>
-              </w:rPr>
-              <w:t>Kenya</w:t>
-            </w:r>
-          </w:p>
-        </w:tc>
-        <w:tc>
-          <w:tcPr>
-            <w:tcW w:type="dxa" w:w="1814"/>
-            <w:vAlign w:val="center"/>
-          </w:tcPr>
-          <w:p>
-            <w:pPr>
-              <w:spacing w:after="20" w:line="252" w:lineRule="auto"/>
-              <w:jc w:val="right"/>
-            </w:pPr>
-            <w:r>
-              <w:rPr>
-                <w:sz w:val="19"/>
-              </w:rPr>
-              <w:t>KSh 64,499</w:t>
-            </w:r>
-          </w:p>
-        </w:tc>
-        <w:tc>
-          <w:tcPr>
-            <w:tcW w:type="dxa" w:w="2041"/>
-            <w:vAlign w:val="center"/>
-          </w:tcPr>
-          <w:p>
-            <w:pPr>
-              <w:spacing w:after="20" w:line="252" w:lineRule="auto"/>
-              <w:jc w:val="right"/>
-            </w:pPr>
-            <w:r>
-              <w:rPr>
-                <w:sz w:val="19"/>
-              </w:rPr>
-              <w:t>KSh 44,999</w:t>
-            </w:r>
-          </w:p>
-        </w:tc>
-        <w:tc>
-          <w:tcPr>
-            <w:tcW w:type="dxa" w:w="1928"/>
-            <w:vAlign w:val="center"/>
-          </w:tcPr>
-          <w:p>
-            <w:pPr>
-              <w:spacing w:after="20" w:line="252" w:lineRule="auto"/>
-              <w:jc w:val="right"/>
-            </w:pPr>
-            <w:r>
-              <w:rPr>
-                <w:sz w:val="19"/>
-              </w:rPr>
-              <w:t>KSh 449,990</w:t>
-            </w:r>
-          </w:p>
-        </w:tc>
-      </w:tr>
-      <w:tr>
-        <w:trPr>
-          <w:cantSplit/>
-        </w:trPr>
-        <w:tc>
-          <w:tcPr>
-            <w:tcW w:type="dxa" w:w="1247"/>
-            <w:shd w:val="clear" w:color="auto" w:fill="FAFAFB"/>
-            <w:vAlign w:val="center"/>
-          </w:tcPr>
-          <w:p>
-            <w:pPr>
-              <w:spacing w:after="20" w:line="252" w:lineRule="auto"/>
-            </w:pPr>
-            <w:r>
-              <w:rPr>
-                <w:b/>
-                <w:sz w:val="19"/>
-              </w:rPr>
-              <w:t>GHS</w:t>
-            </w:r>
-          </w:p>
-        </w:tc>
-        <w:tc>
-          <w:tcPr>
-            <w:tcW w:type="dxa" w:w="2608"/>
-            <w:shd w:val="clear" w:color="auto" w:fill="FAFAFB"/>
-            <w:vAlign w:val="center"/>
-          </w:tcPr>
-          <w:p>
-            <w:pPr>
-              <w:spacing w:after="20" w:line="252" w:lineRule="auto"/>
-            </w:pPr>
-            <w:r>
-              <w:rPr>
-                <w:sz w:val="19"/>
-              </w:rPr>
-              <w:t>Ghana</w:t>
-            </w:r>
-          </w:p>
-        </w:tc>
-        <w:tc>
-          <w:tcPr>
-            <w:tcW w:type="dxa" w:w="1814"/>
-            <w:shd w:val="clear" w:color="auto" w:fill="FAFAFB"/>
-            <w:vAlign w:val="center"/>
-          </w:tcPr>
-          <w:p>
-            <w:pPr>
-              <w:spacing w:after="20" w:line="252" w:lineRule="auto"/>
-              <w:jc w:val="right"/>
-            </w:pPr>
-            <w:r>
-              <w:rPr>
-                <w:sz w:val="19"/>
-              </w:rPr>
-              <w:t>GH₵ 5,439</w:t>
-            </w:r>
-          </w:p>
-        </w:tc>
-        <w:tc>
-          <w:tcPr>
-            <w:tcW w:type="dxa" w:w="2041"/>
-            <w:shd w:val="clear" w:color="auto" w:fill="FAFAFB"/>
-            <w:vAlign w:val="center"/>
-          </w:tcPr>
-          <w:p>
-            <w:pPr>
-              <w:spacing w:after="20" w:line="252" w:lineRule="auto"/>
-              <w:jc w:val="right"/>
-            </w:pPr>
-            <w:r>
-              <w:rPr>
-                <w:sz w:val="19"/>
-              </w:rPr>
-              <w:t>GH₵ 3,799</w:t>
-            </w:r>
-          </w:p>
-        </w:tc>
-        <w:tc>
-          <w:tcPr>
-            <w:tcW w:type="dxa" w:w="1928"/>
-            <w:shd w:val="clear" w:color="auto" w:fill="FAFAFB"/>
-            <w:vAlign w:val="center"/>
-          </w:tcPr>
-          <w:p>
-            <w:pPr>
-              <w:spacing w:after="20" w:line="252" w:lineRule="auto"/>
-              <w:jc w:val="right"/>
-            </w:pPr>
-            <w:r>
-              <w:rPr>
-                <w:sz w:val="19"/>
-              </w:rPr>
-              <w:t>GH₵ 37,990</w:t>
-            </w:r>
-          </w:p>
-        </w:tc>
-      </w:tr>
-      <w:tr>
-        <w:trPr>
-          <w:cantSplit/>
-        </w:trPr>
-        <w:tc>
-          <w:tcPr>
-            <w:tcW w:type="dxa" w:w="1247"/>
-            <w:vAlign w:val="center"/>
-          </w:tcPr>
-          <w:p>
-            <w:pPr>
-              <w:spacing w:after="20" w:line="252" w:lineRule="auto"/>
-            </w:pPr>
-            <w:r>
-              <w:rPr>
-                <w:b/>
-                <w:sz w:val="19"/>
-              </w:rPr>
-              <w:t>USD</w:t>
-            </w:r>
-          </w:p>
-        </w:tc>
-        <w:tc>
-          <w:tcPr>
-            <w:tcW w:type="dxa" w:w="2608"/>
-            <w:vAlign w:val="center"/>
-          </w:tcPr>
-          <w:p>
-            <w:pPr>
-              <w:spacing w:after="20" w:line="252" w:lineRule="auto"/>
-            </w:pPr>
-            <w:r>
-              <w:rPr>
-                <w:sz w:val="19"/>
-              </w:rPr>
-              <w:t>19 other rail-covered countries</w:t>
-            </w:r>
-          </w:p>
-        </w:tc>
-        <w:tc>
-          <w:tcPr>
-            <w:tcW w:type="dxa" w:w="1814"/>
-            <w:vAlign w:val="center"/>
-          </w:tcPr>
-          <w:p>
-            <w:pPr>
-              <w:spacing w:after="20" w:line="252" w:lineRule="auto"/>
-              <w:jc w:val="right"/>
-            </w:pPr>
-            <w:r>
-              <w:rPr>
-                <w:sz w:val="19"/>
-              </w:rPr>
-              <w:t>$429</w:t>
-            </w:r>
-          </w:p>
-        </w:tc>
-        <w:tc>
-          <w:tcPr>
-            <w:tcW w:type="dxa" w:w="2041"/>
-            <w:vAlign w:val="center"/>
-          </w:tcPr>
-          <w:p>
-            <w:pPr>
-              <w:spacing w:after="20" w:line="252" w:lineRule="auto"/>
-              <w:jc w:val="right"/>
-            </w:pPr>
-            <w:r>
-              <w:rPr>
-                <w:sz w:val="19"/>
-              </w:rPr>
-              <w:t>$299</w:t>
-            </w:r>
-          </w:p>
-        </w:tc>
-        <w:tc>
-          <w:tcPr>
-            <w:tcW w:type="dxa" w:w="1928"/>
-            <w:vAlign w:val="center"/>
-          </w:tcPr>
-          <w:p>
-            <w:pPr>
-              <w:spacing w:after="20" w:line="252" w:lineRule="auto"/>
-              <w:jc w:val="right"/>
-            </w:pPr>
-            <w:r>
-              <w:rPr>
-                <w:sz w:val="19"/>
-              </w:rPr>
-              <w:t>$2,990</w:t>
+              <w:t>R69,990</w:t>
             </w:r>
           </w:p>
         </w:tc>
@@ -2775,7 +2321,7 @@
       </w:pPr>
       <w:r>
         <w:rPr/>
-        <w:t>Annual = 10× monthly (2 months free).</w:t>
+        <w:t>Payment first: the first month is paid when you subscribe. No trial period.</w:t>
       </w:r>
     </w:p>
     <w:p>
@@ -2784,7 +2330,7 @@
       </w:pPr>
       <w:r>
         <w:rPr/>
-        <w:t>Wholesale pricing doesn't stack with the Founding Member launch offer, which isn't offered on the Agency tier.</w:t>
+        <w:t>Wholesale pricing doesn't stack with the Founding Member offer, which isn't offered on the Agency tier.</w:t>
       </w:r>
     </w:p>
     <w:p>
@@ -2793,7 +2339,7 @@
       </w:pPr>
       <w:r>
         <w:rPr/>
-        <w:t>Nigeria, Kenya and Ghana are billed in local currency; prices are reviewed quarterly.</w:t>
+        <w:t>Paid plans are for South African businesses. Clients outside South Africa can join the waitlist.</w:t>
       </w:r>
     </w:p>
     <w:p>
@@ -2802,16 +2348,7 @@
       </w:pPr>
       <w:r>
         <w:rPr/>
-        <w:t>Countries without a payment rail (including Botswana and Namibia, coming soon) are waitlist only: no prices or checkout.</w:t>
-      </w:r>
-    </w:p>
-    <w:p>
-      <w:pPr>
-        <w:pStyle w:val="ListBullet"/>
-      </w:pPr>
-      <w:r>
-        <w:rPr/>
-        <w:t>Pass-through costs (Meta WhatsApp message fees, ad spend, SMS) are separate and can be re-billed to your clients.</w:t>
+        <w:t>Pass-through costs (Meta WhatsApp message fees, ad spend) are separate and can be re-billed to your clients.</w:t>
       </w:r>
     </w:p>
     <w:p>
@@ -2942,7 +2479,7 @@
                 <w:b/>
                 <w:sz w:val="19"/>
               </w:rPr>
-              <w:t>Clients on sub-accounts</w:t>
+              <w:t>Clients served</w:t>
             </w:r>
           </w:p>
         </w:tc>
@@ -3087,7 +2624,7 @@
               <w:rPr>
                 <w:sz w:val="19"/>
               </w:rPr>
-              <w:t>− R5,599</w:t>
+              <w:t>− R6,999</w:t>
             </w:r>
           </w:p>
         </w:tc>
@@ -3131,7 +2668,7 @@
                 <w:b/>
                 <w:sz w:val="19"/>
               </w:rPr>
-              <w:t>R24,401</w:t>
+              <w:t>R23,001</w:t>
             </w:r>
           </w:p>
         </w:tc>
@@ -3155,7 +2692,7 @@
                 <w:b/>
                 <w:sz w:val="19"/>
               </w:rPr>
-              <w:t>Platform cost per client (R5,599 ÷ 20)</w:t>
+              <w:t>Platform cost per client (R6,999 ÷ 20)</w:t>
             </w:r>
           </w:p>
         </w:tc>
@@ -3174,7 +2711,7 @@
               <w:rPr>
                 <w:sz w:val="19"/>
               </w:rPr>
-              <w:t>about R280</w:t>
+              <w:t>about R350</w:t>
             </w:r>
           </w:p>
         </w:tc>
@@ -3190,7 +2727,7 @@
         <w:rPr>
           <w:sz w:val="18"/>
         </w:rPr>
-        <w:t>Before VAT, payment fees, ad spend and your team's delivery costs. Your margin depends on your retail price and costs.</w:t>
+        <w:t>Before payment fees, ad spend and your team's delivery costs. Your margin depends on your retail price and costs.</w:t>
       </w:r>
     </w:p>
     <w:p>
@@ -3203,7 +2740,7 @@
         <w:drawing>
           <wp:inline xmlns:a="http://schemas.openxmlformats.org/drawingml/2006/main" xmlns:pic="http://schemas.openxmlformats.org/drawingml/2006/picture">
             <wp:extent cx="6120000" cy="3442500"/>
-            <wp:docPr id="3" name="Picture 3" descr="Partner model diagram: FluxMuse supplies the platform to the agency at the wholesale Agency tier price, the agency serves its clients on sub-accounts at a retail price it sets, with an illustrative 20-client example."/>
+            <wp:docPr id="3" name="Picture 3" descr="Partner model diagram: FluxMuse supplies the platform to the agency at the wholesale price; the agency serves its clients at a retail price it sets."/>
             <wp:cNvGraphicFramePr>
               <a:graphicFrameLocks noChangeAspect="1"/>
             </wp:cNvGraphicFramePr>
@@ -3428,7 +2965,7 @@
               <w:rPr>
                 <w:sz w:val="19"/>
               </w:rPr>
-              <w:t>Up to 50 sub-accounts</w:t>
+              <w:t>Your client count</w:t>
             </w:r>
           </w:p>
         </w:tc>
@@ -3672,7 +3209,7 @@
               <w:rPr>
                 <w:sz w:val="19"/>
               </w:rPr>
-              <w:t>R5,599 (or local currency)</w:t>
+              <w:t>R6,999</w:t>
             </w:r>
           </w:p>
         </w:tc>
@@ -4233,7 +3770,7 @@
               <w:rPr>
                 <w:sz w:val="18"/>
               </w:rPr>
-              <w:t>); reseller billing and retail price list</w:t>
+              <w:t>); your retail price list</w:t>
             </w:r>
           </w:p>
         </w:tc>
@@ -4310,7 +3847,7 @@
               <w:rPr>
                 <w:sz w:val="18"/>
               </w:rPr>
-              <w:t>AI agents; WhatsApp Embedded Signup for clients; catalog and checkout; campaigns with approvals; reports</w:t>
+              <w:t>WhatsApp set-up for clients; WhatsApp Concierge and shop links; POST captions and images; broadcasts</w:t>
             </w:r>
           </w:p>
         </w:tc>
@@ -4377,7 +3914,7 @@
               <w:rPr>
                 <w:sz w:val="18"/>
               </w:rPr>
-              <w:t>First pilot client</w:t>
+              <w:t>First client</w:t>
             </w:r>
           </w:p>
         </w:tc>
@@ -4394,7 +3931,7 @@
               <w:rPr>
                 <w:sz w:val="18"/>
               </w:rPr>
-              <w:t xml:space="preserve">Sub-account for </w:t>
+              <w:t xml:space="preserve">Workspace for </w:t>
             </w:r>
             <w:r>
               <w:rPr>
@@ -4403,13 +3940,13 @@
                 <w:sz w:val="18"/>
                 <w:shd w:val="clear" w:color="auto" w:fill="FFF1A8"/>
               </w:rPr>
-              <w:t>[[PILOT CLIENT]]</w:t>
+              <w:t>[[FIRST CLIENT]]</w:t>
             </w:r>
             <w:r>
               <w:rPr>
                 <w:sz w:val="18"/>
               </w:rPr>
-              <w:t>; WhatsApp number, catalog, payment rail, content calendar; baseline agreed</w:t>
+              <w:t>; WhatsApp number, shop, first posts; targets agreed</w:t>
             </w:r>
           </w:p>
         </w:tc>
@@ -4486,7 +4023,7 @@
               <w:rPr>
                 <w:sz w:val="18"/>
               </w:rPr>
-              <w:t xml:space="preserve">First white-label report; review with FluxMuse; plan for the next </w:t>
+              <w:t xml:space="preserve">Review with FluxMuse, including the lead guarantee count; plan for the next </w:t>
             </w:r>
             <w:r>
               <w:rPr>
@@ -4528,6 +4065,82 @@
     <w:p>
       <w:pPr>
         <w:spacing w:after="0" w:line="120" w:lineRule="exact"/>
+      </w:pPr>
+    </w:p>
+    <w:tbl>
+      <w:tblPr>
+        <w:tblW w:w="9637" w:type="dxa"/>
+        <w:jc w:val="center"/>
+        <w:tblBorders/>
+        <w:tblLayout w:type="fixed"/>
+        <w:tblCellMar>
+          <w:top w:w="50" w:type="dxa"/>
+          <w:left w:w="100" w:type="dxa"/>
+          <w:bottom w:w="50" w:type="dxa"/>
+          <w:right w:w="100" w:type="dxa"/>
+        </w:tblCellMar>
+        <w:tblLook w:firstColumn="1" w:firstRow="1" w:lastColumn="0" w:lastRow="0" w:noHBand="0" w:noVBand="1" w:val="04A0"/>
+        <w:tblCaption w:val="Layout: callout"/>
+      </w:tblPr>
+      <w:tblGrid>
+        <w:gridCol w:w="9637"/>
+      </w:tblGrid>
+      <w:tr>
+        <w:tc>
+          <w:tcPr>
+            <w:tcW w:type="dxa" w:w="9638"/>
+            <w:tcBorders>
+              <w:top w:val="nil" w:sz="0" w:space="0" w:color="auto"/>
+              <w:left w:val="single" w:sz="36" w:space="0" w:color="FF6A00"/>
+              <w:bottom w:val="nil" w:sz="0" w:space="0" w:color="auto"/>
+              <w:right w:val="nil" w:sz="0" w:space="0" w:color="auto"/>
+            </w:tcBorders>
+            <w:shd w:val="clear" w:color="auto" w:fill="FFF4EB"/>
+            <w:tcMar>
+              <w:top w:w="140" w:type="dxa"/>
+              <w:left w:w="220" w:type="dxa"/>
+              <w:bottom w:w="120" w:type="dxa"/>
+              <w:right w:w="200" w:type="dxa"/>
+            </w:tcMar>
+          </w:tcPr>
+          <w:p>
+            <w:pPr>
+              <w:spacing w:after="80"/>
+            </w:pPr>
+            <w:r>
+              <w:rPr>
+                <w:rFonts w:ascii="Poppins" w:hAnsi="Poppins" w:cs="Poppins" w:eastAsia="Poppins"/>
+                <w:b/>
+                <w:color w:val="20242B"/>
+                <w:sz w:val="23"/>
+              </w:rPr>
+              <w:t>Lead guarantee for each client you bring live</w:t>
+            </w:r>
+          </w:p>
+          <w:p>
+            <w:pPr>
+              <w:spacing w:after="80"/>
+            </w:pPr>
+            <w:r>
+              <w:rPr>
+                <w:b/>
+                <w:sz w:val="19"/>
+              </w:rPr>
+              <w:t>Lead guarantee:</w:t>
+            </w:r>
+            <w:r>
+              <w:rPr>
+                <w:sz w:val="19"/>
+              </w:rPr>
+              <w:t xml:space="preserve"> 3 qualified leads in the client's first 30 days after go-live. A qualified lead is a unique WhatsApp number that starts a conversation through a FluxMuse-tracked link or QR code. If fewer than 3 arrive and the client held up their side (shared the link and posted at least weekly), we keep working with you and the client at no extra charge until they have 3. It is extra support, not a cash payment.</w:t>
+            </w:r>
+          </w:p>
+        </w:tc>
+      </w:tr>
+    </w:tbl>
+    <w:p>
+      <w:pPr>
+        <w:spacing w:after="0" w:line="160" w:lineRule="exact"/>
       </w:pPr>
     </w:p>
     <w:p>
@@ -4738,9 +4351,12 @@
             </w:pPr>
             <w:r>
               <w:rPr>
+                <w:b/>
+                <w:color w:val="20242B"/>
                 <w:sz w:val="18"/>
+                <w:shd w:val="clear" w:color="auto" w:fill="FFF1A8"/>
               </w:rPr>
-              <w:t>Live feature</w:t>
+              <w:t>[[FOUNDER TO CONFIRM]]</w:t>
             </w:r>
           </w:p>
         </w:tc>
@@ -4893,7 +4509,7 @@
               <w:rPr>
                 <w:sz w:val="18"/>
               </w:rPr>
-              <w:t>First client's results and written consent</w:t>
+              <w:t>First client's written consent</w:t>
             </w:r>
           </w:p>
         </w:tc>
@@ -4910,7 +4526,7 @@
               <w:rPr>
                 <w:sz w:val="18"/>
               </w:rPr>
-              <w:t>After 60 days</w:t>
+              <w:t>Later, consent only</w:t>
             </w:r>
           </w:p>
         </w:tc>
@@ -5729,7 +5345,7 @@
               <w:rPr>
                 <w:sz w:val="19"/>
               </w:rPr>
-              <w:t>Follow Meta WhatsApp Business policies: approved templates, opted-in contacts, opt-outs honoured</w:t>
+              <w:t>Follow POPIA and Meta WhatsApp Business policies: approved templates, opted-in contacts, opt-outs honoured</w:t>
             </w:r>
           </w:p>
         </w:tc>
@@ -5769,7 +5385,7 @@
               <w:rPr>
                 <w:sz w:val="19"/>
               </w:rPr>
-              <w:t xml:space="preserve">POPIA (and NDPR/GDPR where relevant); data processing agreement </w:t>
+              <w:t xml:space="preserve">POPIA; data processing agreement </w:t>
             </w:r>
             <w:r>
               <w:rPr>
@@ -6124,7 +5740,7 @@
               <w:rPr>
                 <w:sz w:val="19"/>
               </w:rPr>
-              <w:t>Promising Instagram publishing, comments or DMs before Meta approval</w:t>
+              <w:t>Promising Facebook or Instagram auto-posting, or checkout, before they are switched on</w:t>
             </w:r>
           </w:p>
         </w:tc>
@@ -6204,7 +5820,7 @@
               <w:rPr>
                 <w:sz w:val="19"/>
               </w:rPr>
-              <w:t>Offering prices or checkout in gated countries, or combining Founding Member with wholesale pricing</w:t>
+              <w:t>Offering paid plans outside South Africa, or combining Founding Member with wholesale pricing</w:t>
             </w:r>
           </w:p>
         </w:tc>
@@ -6232,11 +5848,11 @@
         <w:rPr>
           <w:b/>
         </w:rPr>
-        <w:t>Fluxmuse Pty Ltd</w:t>
+        <w:t>Fluxmuse (Pty) Ltd</w:t>
       </w:r>
       <w:r>
         <w:rPr/>
-        <w:t xml:space="preserve"> (South Africa): Meta Business Verification: Verified. Meta Access Verification: Verified (Tech Provider).</w:t>
+        <w:t xml:space="preserve"> (South Africa): a verified Meta Tech Provider (business and access verification, September 2026).</w:t>
       </w:r>
     </w:p>
     <w:p>
@@ -6251,7 +5867,7 @@
       </w:r>
       <w:r>
         <w:rPr/>
-        <w:t xml:space="preserve"> pages_show_list, pages_manage_metadata, pages_messaging, whatsapp_business_messaging, whatsapp_business_management, public_profile.</w:t>
+        <w:t xml:space="preserve"> WhatsApp Business messaging and management, and Facebook Page messaging.</w:t>
       </w:r>
     </w:p>
     <w:p>
@@ -6262,11 +5878,11 @@
         <w:rPr>
           <w:b/>
         </w:rPr>
-        <w:t>Pending Meta approval (in App Review, not live yet):</w:t>
+        <w:t>Waiting for Meta approval (not live):</w:t>
       </w:r>
       <w:r>
         <w:rPr/>
-        <w:t xml:space="preserve"> pages_manage_posts, pages_read_engagement, instagram_basic, instagram_content_publish, instagram_manage_comments, instagram_manage_messages, business_management. Instagram features are switched on only once Meta approves them.</w:t>
+        <w:t xml:space="preserve"> posting to Facebook Pages and Instagram, and Instagram comments and DMs. They are switched on only once Meta approves them.</w:t>
       </w:r>
     </w:p>
     <w:p>
@@ -6277,11 +5893,11 @@
         <w:rPr>
           <w:b/>
         </w:rPr>
-        <w:t>Data protection:</w:t>
+        <w:t>Payments:</w:t>
       </w:r>
       <w:r>
         <w:rPr/>
-        <w:t xml:space="preserve"> POPIA, NDPR and GDPR ready; row-level security on every table; encrypted tokens; audit export; data export and account deletion.</w:t>
+        <w:t xml:space="preserve"> Paystack is live in South Africa. Yoco and Ozow run FluxMuse's own subscription billing.</w:t>
       </w:r>
     </w:p>
     <w:p>
@@ -6311,7 +5927,7 @@
     <w:p>
       <w:r>
         <w:rPr/>
-        <w:t>Fluxmuse Pty Ltd processes personal information in line with the Protection of Personal Information Act, 2013 (POPIA), and the platform is built to be POPIA, NDPR and GDPR ready. For this proposal:</w:t>
+        <w:t>Fluxmuse (Pty) Ltd processes personal information in line with the Protection of Personal Information Act, 2013 (POPIA). For this proposal:</w:t>
       </w:r>
     </w:p>
     <w:p>
@@ -6366,7 +5982,7 @@
       </w:pPr>
       <w:r>
         <w:rPr/>
-        <w:t>Marketing messages on WhatsApp, SMS and email go only to people who have opted in, and every broadcast includes a way to opt out. Email suppression lists are kept in FluxMuse.</w:t>
+        <w:t>WhatsApp broadcasts go only to people who have opted in, and every broadcast includes a way to opt out.</w:t>
       </w:r>
     </w:p>
     <w:p>
@@ -6375,7 +5991,7 @@
       </w:pPr>
       <w:r>
         <w:rPr/>
-        <w:t>Platform safeguards: row-level security on every database table, encrypted access tokens, audit export, and data export and account deletion on request.</w:t>
+        <w:t>Platform safeguards: row-level security on database tables, encrypted access tokens, and data export and account deletion on request.</w:t>
       </w:r>
     </w:p>
     <w:p>
@@ -6666,7 +6282,7 @@
                 <w:b/>
                 <w:sz w:val="18"/>
               </w:rPr>
-              <w:t>Free trial</w:t>
+              <w:t>Payment first</w:t>
             </w:r>
           </w:p>
         </w:tc>
@@ -6683,16 +6299,7 @@
               <w:rPr>
                 <w:sz w:val="18"/>
               </w:rPr>
-              <w:t xml:space="preserve">14-day free trial, no card required. Conversion to a paid plan: </w:t>
-            </w:r>
-            <w:r>
-              <w:rPr>
-                <w:b/>
-                <w:color w:val="20242B"/>
-                <w:sz w:val="18"/>
-                <w:shd w:val="clear" w:color="auto" w:fill="FFF1A8"/>
-              </w:rPr>
-              <w:t>[[LEGAL REVIEW REQUIRED]]</w:t>
+              <w:t>Every paid plan is paid in advance, from the first month. There is no trial period. The Free plan is a separate permanent plan.</w:t>
             </w:r>
           </w:p>
         </w:tc>
@@ -6763,7 +6370,7 @@
                 <w:sz w:val="18"/>
                 <w:shd w:val="clear" w:color="auto" w:fill="FFF1A8"/>
               </w:rPr>
-              <w:t>[[LEGAL REVIEW REQUIRED: refunds or pro-rating]]</w:t>
+              <w:t>[[LEGAL REVIEW REQUIRED: cancellation of annual plans]]</w:t>
             </w:r>
           </w:p>
           <w:p>
@@ -6774,7 +6381,7 @@
               <w:rPr>
                 <w:sz w:val="18"/>
               </w:rPr>
-              <w:t xml:space="preserve">Launch or pilot pricing on cancellation: </w:t>
+              <w:t xml:space="preserve">Founding Member discount on cancellation: </w:t>
             </w:r>
             <w:r>
               <w:rPr>
@@ -6806,7 +6413,7 @@
                 <w:b/>
                 <w:sz w:val="18"/>
               </w:rPr>
-              <w:t>Payment terms</w:t>
+              <w:t>Lead guarantee</w:t>
             </w:r>
           </w:p>
         </w:tc>
@@ -6823,52 +6430,7 @@
               <w:rPr>
                 <w:sz w:val="18"/>
               </w:rPr>
-              <w:t xml:space="preserve">Billed in advance in </w:t>
-            </w:r>
-            <w:r>
-              <w:rPr>
-                <w:b/>
-                <w:color w:val="20242B"/>
-                <w:sz w:val="18"/>
-                <w:shd w:val="clear" w:color="auto" w:fill="FFF1A8"/>
-              </w:rPr>
-              <w:t>[[CURRENCY]]</w:t>
-            </w:r>
-            <w:r>
-              <w:rPr>
-                <w:sz w:val="18"/>
-              </w:rPr>
-              <w:t xml:space="preserve"> by </w:t>
-            </w:r>
-            <w:r>
-              <w:rPr>
-                <w:b/>
-                <w:color w:val="20242B"/>
-                <w:sz w:val="18"/>
-                <w:shd w:val="clear" w:color="auto" w:fill="FFF1A8"/>
-              </w:rPr>
-              <w:t>[[PAYMENT METHOD]]</w:t>
-            </w:r>
-            <w:r>
-              <w:rPr>
-                <w:sz w:val="18"/>
-              </w:rPr>
-              <w:t xml:space="preserve">, due </w:t>
-            </w:r>
-            <w:r>
-              <w:rPr>
-                <w:b/>
-                <w:color w:val="20242B"/>
-                <w:sz w:val="18"/>
-                <w:shd w:val="clear" w:color="auto" w:fill="FFF1A8"/>
-              </w:rPr>
-              <w:t>[[N]]</w:t>
-            </w:r>
-            <w:r>
-              <w:rPr>
-                <w:sz w:val="18"/>
-              </w:rPr>
-              <w:t xml:space="preserve"> days from invoice. Late payment: </w:t>
+              <w:t xml:space="preserve">3 qualified leads in 30 days of go-live, on the conditions in this proposal; remedy is extended support at no extra charge, not a cash payment. </w:t>
             </w:r>
             <w:r>
               <w:rPr>
@@ -6901,7 +6463,7 @@
                 <w:b/>
                 <w:sz w:val="18"/>
               </w:rPr>
-              <w:t>Price changes</w:t>
+              <w:t>Payment terms</w:t>
             </w:r>
           </w:p>
         </w:tc>
@@ -6919,7 +6481,22 @@
               <w:rPr>
                 <w:sz w:val="18"/>
               </w:rPr>
-              <w:t xml:space="preserve">Notice of price changes: </w:t>
+              <w:t xml:space="preserve">Billed in advance in South African rand by </w:t>
+            </w:r>
+            <w:r>
+              <w:rPr>
+                <w:b/>
+                <w:color w:val="20242B"/>
+                <w:sz w:val="18"/>
+                <w:shd w:val="clear" w:color="auto" w:fill="FFF1A8"/>
+              </w:rPr>
+              <w:t>[[PAYMENT METHOD: Paystack / Yoco / Ozow]]</w:t>
+            </w:r>
+            <w:r>
+              <w:rPr>
+                <w:sz w:val="18"/>
+              </w:rPr>
+              <w:t xml:space="preserve">. Late payment: </w:t>
             </w:r>
             <w:r>
               <w:rPr>
@@ -6929,12 +6506,6 @@
                 <w:shd w:val="clear" w:color="auto" w:fill="FFF1A8"/>
               </w:rPr>
               <w:t>[[LEGAL REVIEW REQUIRED]]</w:t>
-            </w:r>
-            <w:r>
-              <w:rPr>
-                <w:sz w:val="18"/>
-              </w:rPr>
-              <w:t>. Local-currency prices in Nigeria, Kenya and Ghana are reviewed quarterly.</w:t>
             </w:r>
           </w:p>
         </w:tc>
@@ -6957,7 +6528,7 @@
                 <w:b/>
                 <w:sz w:val="18"/>
               </w:rPr>
-              <w:t>Third-party costs</w:t>
+              <w:t>Price changes</w:t>
             </w:r>
           </w:p>
         </w:tc>
@@ -6974,7 +6545,7 @@
               <w:rPr>
                 <w:sz w:val="18"/>
               </w:rPr>
-              <w:t xml:space="preserve">Meta WhatsApp message fees, ad spend, SMS and payment-processing fees are pass-through costs charged by those providers, not FluxMuse fees. Billing route: </w:t>
+              <w:t xml:space="preserve">Notice of price changes: </w:t>
             </w:r>
             <w:r>
               <w:rPr>
@@ -7007,6 +6578,56 @@
                 <w:b/>
                 <w:sz w:val="18"/>
               </w:rPr>
+              <w:t>Third-party costs</w:t>
+            </w:r>
+          </w:p>
+        </w:tc>
+        <w:tc>
+          <w:tcPr>
+            <w:tcW w:type="dxa" w:w="7030"/>
+            <w:shd w:val="clear" w:color="auto" w:fill="FAFAFB"/>
+            <w:vAlign w:val="center"/>
+          </w:tcPr>
+          <w:p>
+            <w:pPr>
+              <w:spacing w:after="20" w:line="252" w:lineRule="auto"/>
+            </w:pPr>
+            <w:r>
+              <w:rPr>
+                <w:sz w:val="18"/>
+              </w:rPr>
+              <w:t xml:space="preserve">Meta WhatsApp message fees, ad spend and payment-processing fees are pass-through costs charged by those providers, not FluxMuse fees. Billing route: </w:t>
+            </w:r>
+            <w:r>
+              <w:rPr>
+                <w:b/>
+                <w:color w:val="20242B"/>
+                <w:sz w:val="18"/>
+                <w:shd w:val="clear" w:color="auto" w:fill="FFF1A8"/>
+              </w:rPr>
+              <w:t>[[LEGAL REVIEW REQUIRED]]</w:t>
+            </w:r>
+          </w:p>
+        </w:tc>
+      </w:tr>
+      <w:tr>
+        <w:trPr>
+          <w:cantSplit/>
+        </w:trPr>
+        <w:tc>
+          <w:tcPr>
+            <w:tcW w:type="dxa" w:w="2608"/>
+            <w:vAlign w:val="center"/>
+          </w:tcPr>
+          <w:p>
+            <w:pPr>
+              <w:spacing w:after="20" w:line="252" w:lineRule="auto"/>
+            </w:pPr>
+            <w:r>
+              <w:rPr>
+                <w:b/>
+                <w:sz w:val="18"/>
+              </w:rPr>
               <w:t>Third-party platforms</w:t>
             </w:r>
           </w:p>
@@ -7014,7 +6635,6 @@
         <w:tc>
           <w:tcPr>
             <w:tcW w:type="dxa" w:w="7030"/>
-            <w:shd w:val="clear" w:color="auto" w:fill="FAFAFB"/>
             <w:vAlign w:val="center"/>
           </w:tcPr>
           <w:p>
@@ -7046,6 +6666,7 @@
         <w:tc>
           <w:tcPr>
             <w:tcW w:type="dxa" w:w="2608"/>
+            <w:shd w:val="clear" w:color="auto" w:fill="FAFAFB"/>
             <w:vAlign w:val="center"/>
           </w:tcPr>
           <w:p>
@@ -7064,6 +6685,7 @@
         <w:tc>
           <w:tcPr>
             <w:tcW w:type="dxa" w:w="7030"/>
+            <w:shd w:val="clear" w:color="auto" w:fill="FAFAFB"/>
             <w:vAlign w:val="center"/>
           </w:tcPr>
           <w:p>
@@ -7075,6 +6697,158 @@
                 <w:sz w:val="18"/>
               </w:rPr>
               <w:t xml:space="preserve">POPIA, as described in this proposal. Operator or data processing agreement: </w:t>
+            </w:r>
+            <w:r>
+              <w:rPr>
+                <w:b/>
+                <w:color w:val="20242B"/>
+                <w:sz w:val="18"/>
+                <w:shd w:val="clear" w:color="auto" w:fill="FFF1A8"/>
+              </w:rPr>
+              <w:t>[[LEGAL REVIEW REQUIRED]]</w:t>
+            </w:r>
+          </w:p>
+        </w:tc>
+      </w:tr>
+      <w:tr>
+        <w:trPr>
+          <w:cantSplit/>
+        </w:trPr>
+        <w:tc>
+          <w:tcPr>
+            <w:tcW w:type="dxa" w:w="2608"/>
+            <w:vAlign w:val="center"/>
+          </w:tcPr>
+          <w:p>
+            <w:pPr>
+              <w:spacing w:after="20" w:line="252" w:lineRule="auto"/>
+            </w:pPr>
+            <w:r>
+              <w:rPr>
+                <w:b/>
+                <w:sz w:val="18"/>
+              </w:rPr>
+              <w:t>Intellectual property</w:t>
+            </w:r>
+          </w:p>
+        </w:tc>
+        <w:tc>
+          <w:tcPr>
+            <w:tcW w:type="dxa" w:w="7030"/>
+            <w:vAlign w:val="center"/>
+          </w:tcPr>
+          <w:p>
+            <w:pPr>
+              <w:spacing w:after="20" w:line="252" w:lineRule="auto"/>
+            </w:pPr>
+            <w:r>
+              <w:rPr>
+                <w:b/>
+                <w:color w:val="20242B"/>
+                <w:sz w:val="18"/>
+                <w:shd w:val="clear" w:color="auto" w:fill="FFF1A8"/>
+              </w:rPr>
+              <w:t>[[LEGAL REVIEW REQUIRED: ownership of client content, AI-generated content, brand assets, platform IP and licences]]</w:t>
+            </w:r>
+          </w:p>
+        </w:tc>
+      </w:tr>
+      <w:tr>
+        <w:trPr>
+          <w:cantSplit/>
+        </w:trPr>
+        <w:tc>
+          <w:tcPr>
+            <w:tcW w:type="dxa" w:w="2608"/>
+            <w:shd w:val="clear" w:color="auto" w:fill="FAFAFB"/>
+            <w:vAlign w:val="center"/>
+          </w:tcPr>
+          <w:p>
+            <w:pPr>
+              <w:spacing w:after="20" w:line="252" w:lineRule="auto"/>
+            </w:pPr>
+            <w:r>
+              <w:rPr>
+                <w:b/>
+                <w:sz w:val="18"/>
+              </w:rPr>
+              <w:t>Confidentiality</w:t>
+            </w:r>
+          </w:p>
+        </w:tc>
+        <w:tc>
+          <w:tcPr>
+            <w:tcW w:type="dxa" w:w="7030"/>
+            <w:shd w:val="clear" w:color="auto" w:fill="FAFAFB"/>
+            <w:vAlign w:val="center"/>
+          </w:tcPr>
+          <w:p>
+            <w:pPr>
+              <w:spacing w:after="20" w:line="252" w:lineRule="auto"/>
+            </w:pPr>
+            <w:r>
+              <w:rPr>
+                <w:b/>
+                <w:color w:val="20242B"/>
+                <w:sz w:val="18"/>
+                <w:shd w:val="clear" w:color="auto" w:fill="FFF1A8"/>
+              </w:rPr>
+              <w:t>[[LEGAL REVIEW REQUIRED]]</w:t>
+            </w:r>
+          </w:p>
+        </w:tc>
+      </w:tr>
+      <w:tr>
+        <w:trPr>
+          <w:cantSplit/>
+        </w:trPr>
+        <w:tc>
+          <w:tcPr>
+            <w:tcW w:type="dxa" w:w="2608"/>
+            <w:vAlign w:val="center"/>
+          </w:tcPr>
+          <w:p>
+            <w:pPr>
+              <w:spacing w:after="20" w:line="252" w:lineRule="auto"/>
+            </w:pPr>
+            <w:r>
+              <w:rPr>
+                <w:b/>
+                <w:sz w:val="18"/>
+              </w:rPr>
+              <w:t>Support and service levels</w:t>
+            </w:r>
+          </w:p>
+        </w:tc>
+        <w:tc>
+          <w:tcPr>
+            <w:tcW w:type="dxa" w:w="7030"/>
+            <w:vAlign w:val="center"/>
+          </w:tcPr>
+          <w:p>
+            <w:pPr>
+              <w:spacing w:after="20" w:line="252" w:lineRule="auto"/>
+            </w:pPr>
+            <w:r>
+              <w:rPr>
+                <w:sz w:val="18"/>
+              </w:rPr>
+              <w:t xml:space="preserve">Support channel by plan: </w:t>
+            </w:r>
+            <w:r>
+              <w:rPr>
+                <w:b/>
+                <w:color w:val="20242B"/>
+                <w:sz w:val="18"/>
+                <w:shd w:val="clear" w:color="auto" w:fill="FFF1A8"/>
+              </w:rPr>
+              <w:t>[[CONFIRM]]</w:t>
+            </w:r>
+            <w:r>
+              <w:rPr>
+                <w:sz w:val="18"/>
+              </w:rPr>
+              <w:t xml:space="preserve">. Service levels: </w:t>
             </w:r>
             <w:r>
               <w:rPr>
@@ -7107,95 +6881,7 @@
                 <w:b/>
                 <w:sz w:val="18"/>
               </w:rPr>
-              <w:t>Intellectual property</w:t>
-            </w:r>
-          </w:p>
-        </w:tc>
-        <w:tc>
-          <w:tcPr>
-            <w:tcW w:type="dxa" w:w="7030"/>
-            <w:shd w:val="clear" w:color="auto" w:fill="FAFAFB"/>
-            <w:vAlign w:val="center"/>
-          </w:tcPr>
-          <w:p>
-            <w:pPr>
-              <w:spacing w:after="20" w:line="252" w:lineRule="auto"/>
-            </w:pPr>
-            <w:r>
-              <w:rPr>
-                <w:b/>
-                <w:color w:val="20242B"/>
-                <w:sz w:val="18"/>
-                <w:shd w:val="clear" w:color="auto" w:fill="FFF1A8"/>
-              </w:rPr>
-              <w:t>[[LEGAL REVIEW REQUIRED: ownership of client content, AI-generated content, brand assets, platform IP and licences]]</w:t>
-            </w:r>
-          </w:p>
-        </w:tc>
-      </w:tr>
-      <w:tr>
-        <w:trPr>
-          <w:cantSplit/>
-        </w:trPr>
-        <w:tc>
-          <w:tcPr>
-            <w:tcW w:type="dxa" w:w="2608"/>
-            <w:vAlign w:val="center"/>
-          </w:tcPr>
-          <w:p>
-            <w:pPr>
-              <w:spacing w:after="20" w:line="252" w:lineRule="auto"/>
-            </w:pPr>
-            <w:r>
-              <w:rPr>
-                <w:b/>
-                <w:sz w:val="18"/>
-              </w:rPr>
-              <w:t>Confidentiality</w:t>
-            </w:r>
-          </w:p>
-        </w:tc>
-        <w:tc>
-          <w:tcPr>
-            <w:tcW w:type="dxa" w:w="7030"/>
-            <w:vAlign w:val="center"/>
-          </w:tcPr>
-          <w:p>
-            <w:pPr>
-              <w:spacing w:after="20" w:line="252" w:lineRule="auto"/>
-            </w:pPr>
-            <w:r>
-              <w:rPr>
-                <w:b/>
-                <w:color w:val="20242B"/>
-                <w:sz w:val="18"/>
-                <w:shd w:val="clear" w:color="auto" w:fill="FFF1A8"/>
-              </w:rPr>
-              <w:t>[[LEGAL REVIEW REQUIRED]]</w:t>
-            </w:r>
-          </w:p>
-        </w:tc>
-      </w:tr>
-      <w:tr>
-        <w:trPr>
-          <w:cantSplit/>
-        </w:trPr>
-        <w:tc>
-          <w:tcPr>
-            <w:tcW w:type="dxa" w:w="2608"/>
-            <w:shd w:val="clear" w:color="auto" w:fill="FAFAFB"/>
-            <w:vAlign w:val="center"/>
-          </w:tcPr>
-          <w:p>
-            <w:pPr>
-              <w:spacing w:after="20" w:line="252" w:lineRule="auto"/>
-            </w:pPr>
-            <w:r>
-              <w:rPr>
-                <w:b/>
-                <w:sz w:val="18"/>
-              </w:rPr>
-              <w:t>Support and service levels</w:t>
+              <w:t>Wholesale pricing</w:t>
             </w:r>
           </w:p>
         </w:tc>
@@ -7213,7 +6899,7 @@
               <w:rPr>
                 <w:sz w:val="18"/>
               </w:rPr>
-              <w:t xml:space="preserve">Support channel by plan (community, email, priority or dedicated). Service levels: </w:t>
+              <w:t xml:space="preserve">30% off Agency list for as long as the partner agreement is active </w:t>
             </w:r>
             <w:r>
               <w:rPr>
@@ -7245,7 +6931,7 @@
                 <w:b/>
                 <w:sz w:val="18"/>
               </w:rPr>
-              <w:t>Wholesale pricing</w:t>
+              <w:t>White-label and multi-client</w:t>
             </w:r>
           </w:p>
         </w:tc>
@@ -7262,7 +6948,7 @@
               <w:rPr>
                 <w:sz w:val="18"/>
               </w:rPr>
-              <w:t xml:space="preserve">30% off Agency list for as long as the partner agreement is active </w:t>
+              <w:t xml:space="preserve">Client data ownership and portability on termination: </w:t>
             </w:r>
             <w:r>
               <w:rPr>
@@ -7295,7 +6981,7 @@
                 <w:b/>
                 <w:sz w:val="18"/>
               </w:rPr>
-              <w:t>White-label and sub-accounts</w:t>
+              <w:t>Referral commission</w:t>
             </w:r>
           </w:p>
         </w:tc>
@@ -7303,55 +6989,6 @@
           <w:tcPr>
             <w:tcW w:type="dxa" w:w="7030"/>
             <w:shd w:val="clear" w:color="auto" w:fill="FAFAFB"/>
-            <w:vAlign w:val="center"/>
-          </w:tcPr>
-          <w:p>
-            <w:pPr>
-              <w:spacing w:after="20" w:line="252" w:lineRule="auto"/>
-            </w:pPr>
-            <w:r>
-              <w:rPr>
-                <w:sz w:val="18"/>
-              </w:rPr>
-              <w:t xml:space="preserve">Up to 50 client sub-accounts; client data ownership and portability on termination: </w:t>
-            </w:r>
-            <w:r>
-              <w:rPr>
-                <w:b/>
-                <w:color w:val="20242B"/>
-                <w:sz w:val="18"/>
-                <w:shd w:val="clear" w:color="auto" w:fill="FFF1A8"/>
-              </w:rPr>
-              <w:t>[[LEGAL REVIEW REQUIRED]]</w:t>
-            </w:r>
-          </w:p>
-        </w:tc>
-      </w:tr>
-      <w:tr>
-        <w:trPr>
-          <w:cantSplit/>
-        </w:trPr>
-        <w:tc>
-          <w:tcPr>
-            <w:tcW w:type="dxa" w:w="2608"/>
-            <w:vAlign w:val="center"/>
-          </w:tcPr>
-          <w:p>
-            <w:pPr>
-              <w:spacing w:after="20" w:line="252" w:lineRule="auto"/>
-            </w:pPr>
-            <w:r>
-              <w:rPr>
-                <w:b/>
-                <w:sz w:val="18"/>
-              </w:rPr>
-              <w:t>Referral commission</w:t>
-            </w:r>
-          </w:p>
-        </w:tc>
-        <w:tc>
-          <w:tcPr>
-            <w:tcW w:type="dxa" w:w="7030"/>
             <w:vAlign w:val="center"/>
           </w:tcPr>
           <w:p>
@@ -7392,7 +7029,6 @@
         <w:tc>
           <w:tcPr>
             <w:tcW w:type="dxa" w:w="2608"/>
-            <w:shd w:val="clear" w:color="auto" w:fill="FAFAFB"/>
             <w:vAlign w:val="center"/>
           </w:tcPr>
           <w:p>
@@ -7411,7 +7047,6 @@
         <w:tc>
           <w:tcPr>
             <w:tcW w:type="dxa" w:w="7030"/>
-            <w:shd w:val="clear" w:color="auto" w:fill="FAFAFB"/>
             <w:vAlign w:val="center"/>
           </w:tcPr>
           <w:p>
@@ -7458,6 +7093,7 @@
         <w:tc>
           <w:tcPr>
             <w:tcW w:type="dxa" w:w="2608"/>
+            <w:shd w:val="clear" w:color="auto" w:fill="FAFAFB"/>
             <w:vAlign w:val="center"/>
           </w:tcPr>
           <w:p>
@@ -7476,6 +7112,7 @@
         <w:tc>
           <w:tcPr>
             <w:tcW w:type="dxa" w:w="7030"/>
+            <w:shd w:val="clear" w:color="auto" w:fill="FAFAFB"/>
             <w:vAlign w:val="center"/>
           </w:tcPr>
           <w:p>
@@ -7515,19 +7152,7 @@
       </w:pPr>
       <w:r>
         <w:rPr/>
-        <w:t xml:space="preserve">To go ahead, tick your choices, sign below and send a copy to </w:t>
-      </w:r>
-      <w:r>
-        <w:rPr>
-          <w:b/>
-          <w:color w:val="20242B"/>
-          <w:shd w:val="clear" w:color="auto" w:fill="FFF1A8"/>
-        </w:rPr>
-        <w:t>[[EMAIL]]</w:t>
-      </w:r>
-      <w:r>
-        <w:rPr/>
-        <w:t xml:space="preserve"> or WhatsApp </w:t>
+        <w:t xml:space="preserve">To go ahead, tick your choices, sign below and send a copy to thabo@fluxmuse.com or WhatsApp </w:t>
       </w:r>
       <w:r>
         <w:rPr>
@@ -7587,15 +7212,7 @@
       <w:r>
         <w:rPr/>
         <w:tab/>
-        <w:t xml:space="preserve">Partner wholesale, monthly: </w:t>
-      </w:r>
-      <w:r>
-        <w:rPr>
-          <w:b/>
-          <w:color w:val="20242B"/>
-          <w:shd w:val="clear" w:color="auto" w:fill="FFF1A8"/>
-        </w:rPr>
-        <w:t>[[R5,599 / ₦463,000 / KSh 44,999 / GH₵ 3,799 / $299]]</w:t>
+        <w:t>Partner wholesale, monthly: R6,999/mo</w:t>
       </w:r>
     </w:p>
     <w:p>
@@ -7631,15 +7248,7 @@
       <w:r>
         <w:rPr/>
         <w:tab/>
-        <w:t xml:space="preserve">Partner wholesale, annual: </w:t>
-      </w:r>
-      <w:r>
-        <w:rPr>
-          <w:b/>
-          <w:color w:val="20242B"/>
-          <w:shd w:val="clear" w:color="auto" w:fill="FFF1A8"/>
-        </w:rPr>
-        <w:t>[[R55,990 / ₦4,630,000 / KSh 449,990 / GH₵ 37,990 / $2,990]]</w:t>
+        <w:t>Partner wholesale, annual: R69,990/yr</w:t>
       </w:r>
     </w:p>
     <w:p>
@@ -7687,7 +7296,7 @@
       </w:r>
       <w:r>
         <w:rPr/>
-        <w:t xml:space="preserve"> with first pilot client </w:t>
+        <w:t xml:space="preserve"> with first client </w:t>
       </w:r>
       <w:r>
         <w:rPr>
@@ -7695,7 +7304,7 @@
           <w:color w:val="20242B"/>
           <w:shd w:val="clear" w:color="auto" w:fill="FFF1A8"/>
         </w:rPr>
-        <w:t>[[PILOT CLIENT]]</w:t>
+        <w:t>[[FIRST CLIENT]]</w:t>
       </w:r>
     </w:p>
     <w:p>
@@ -7911,7 +7520,7 @@
                 <w:color w:val="20242B"/>
                 <w:sz w:val="20"/>
               </w:rPr>
-              <w:t>For Fluxmuse Pty Ltd</w:t>
+              <w:t>For Fluxmuse (Pty) Ltd</w:t>
             </w:r>
           </w:p>
         </w:tc>

</xml_diff>